<commit_message>
Update mrope tutorial delivery
</commit_message>
<xml_diff>
--- a/third_party/ascend/tutorials/mrope/Mrope算子设计方案.docx
+++ b/third_party/ascend/tutorials/mrope/Mrope算子设计方案.docx
@@ -4,178 +4,87 @@
   <w:body>
     <w:p>
       <w:r>
-        <w:rPr>
-          <w:b/>
-          <w:sz w:val="40"/>
-        </w:rPr>
         <w:t>MRoPE算子设计方案</w:t>
       </w:r>
     </w:p>
     <w:p>
       <w:r>
-        <w:t>本文档基于 docs/mrope.md、Triton-Ascend 实现源码和 OpForge/CANN-Bench 评测证据生成。</w:t>
+        <w:t>需求分析</w:t>
       </w:r>
     </w:p>
     <w:p>
       <w:r>
-        <w:rPr>
-          <w:b/>
-          <w:sz w:val="28"/>
-        </w:rPr>
-        <w:t>1. 需求分析</w:t>
+        <w:t>Apply RoPE/MRoPE rotation to BF16 query/key tensors and return query_out/key_out.</w:t>
       </w:r>
     </w:p>
     <w:p>
       <w:r>
-        <w:t>MRoPE 算子在 Ascend NPU 上对 BF16 query/key 张量施加 RoPE 或 MRoPE 旋转，输入包括 positions、query、key、cos_sin_cache，以及 head_size、mrope_section、rotary_mode、cache_mode 属性。</w:t>
+        <w:t>输入：positions, query, key, cos_sin_cache plus head_size/mrope_section/rotary_mode/cache_mode attributes。</w:t>
       </w:r>
     </w:p>
     <w:p>
       <w:r>
-        <w:t>positions 在 RoPE 模式为 [num_tokens]，在 MRoPE 模式为 [3,num_tokens] 或 [4,num_tokens]；query/key 为 [num_tokens, num_heads * head_size]；cos_sin_cache 为 [max_seq_len, rotary_dim]。</w:t>
+        <w:t>输出：query_out and key_out with same shape/dtype as query/key。</w:t>
       </w:r>
     </w:p>
     <w:p>
       <w:r>
-        <w:t>约束包括 head_size 和 rotary_dim 为 32 的倍数、rotary_dim &lt;= head_size、MRoPE section sum 等于 rotary_dim/2、[16,16,16,16] 仅支持 default cache。</w:t>
+        <w:t>当前实现分析、算子整体流程</w:t>
       </w:r>
     </w:p>
     <w:p>
       <w:r>
-        <w:rPr>
-          <w:b/>
-          <w:sz w:val="28"/>
-        </w:rPr>
-        <w:t>2. 算子原型</w:t>
+        <w:t>Optimized pair kernels for common RoPE/MRoPE modes plus generic Triton kernel for legal metadata.</w:t>
       </w:r>
     </w:p>
     <w:p>
       <w:r>
-        <w:t>mrope(Tensor positions, Tensor query, Tensor key, Tensor cos_sin_cache, int head_size=128, list mrope_section=[0,0,0], str rotary_mode="half", str cache_mode="default") -&gt; (Tensor query_out, Tensor key_out)</w:t>
+        <w:t>算子原型</w:t>
       </w:r>
     </w:p>
     <w:p>
       <w:r>
-        <w:t>输出 query_out/key_out 与 query/key 同 shape、同 BF16 dtype。rotary_dim 之外的 tail channel 直接 copy-through。</w:t>
+        <w:t>源码 `mrope.py`，统一推理入口 `run_inference.py`，校验脚本 `validate_mrope.py`。</w:t>
       </w:r>
     </w:p>
     <w:p>
       <w:r>
-        <w:rPr>
-          <w:b/>
-          <w:sz w:val="28"/>
-        </w:rPr>
-        <w:t>3. 实现方案</w:t>
+        <w:t>相关约束</w:t>
       </w:r>
     </w:p>
     <w:p>
       <w:r>
-        <w:t>交付源码位于 mrope.py，核心计算使用 @triton.jit。Python wrapper 只做元数据校验、输出分配和 launch 参数组织。</w:t>
+        <w:t>不支持组合 fail loudly；被测路径无 fallback。</w:t>
       </w:r>
     </w:p>
     <w:p>
       <w:r>
-        <w:t>优化路径包含 RoPE half/default、MRoPE half/default、MRoPE half/interleave rotary64、MRoPE interleaved/default 四类 pair kernel；pair kernel 在一个 launch 中同时写 query_out 和 key_out。</w:t>
+        <w:t>需求详细设计</w:t>
       </w:r>
     </w:p>
     <w:p>
       <w:r>
-        <w:t>未命中优化路径但合同允许的元数据走同 backend generic Triton kernel，不会转向 PyTorch、torch_npu、CANN/vendor whole-op、CPU 或任务 golden。</w:t>
+        <w:t>调度仅依赖合法运行时元数据，不依赖 case id、workload、输入值或 timing signature。</w:t>
       </w:r>
     </w:p>
     <w:p>
       <w:r>
-        <w:rPr>
-          <w:b/>
-          <w:sz w:val="28"/>
-        </w:rPr>
-        <w:t>4. 调度策略</w:t>
+        <w:t>精度标准/性能标准</w:t>
       </w:r>
     </w:p>
     <w:p>
       <w:r>
-        <w:t>full-rotary MRoPE half/default 使用 [64 heads, 64 columns] tile，在 token/head block 内复用同一条 cos/sin 向量。其他 pair 路径使用较小 head block。</w:t>
+        <w:t>L1 指标口径参考 references/commercial_standard.md，RMSE/MERE/MARE 由本目录 checker 输出；本报告是教程自验证，不等同完整商业 L1 认证；主速度门槛按 torch_npu runnable all active/active 几何平均 &gt;= 1.2x，selected baseline 只作语义标杆说明。</w:t>
       </w:r>
     </w:p>
     <w:p>
       <w:r>
-        <w:t>调度只基于 runtime metadata 和实现能力边界：dtype、rank、shape、contiguity、head_size、rotary_dim、positions rows、mrope_section、rotary_mode、cache_mode、q/k head count。</w:t>
+        <w:t>Baseline 自包含流程</w:t>
       </w:r>
     </w:p>
     <w:p>
       <w:r>
-        <w:rPr>
-          <w:b/>
-          <w:sz w:val="28"/>
-        </w:rPr>
-        <w:t>5. 正确性边界</w:t>
-      </w:r>
-    </w:p>
-    <w:p>
-      <w:r>
-        <w:t>MRoPE positions rows 严格限制为 3/4，并要求与 mrope_section 长度匹配；section 元素非负且 sum=rotary_dim/2。</w:t>
-      </w:r>
-    </w:p>
-    <w:p>
-      <w:r>
-        <w:t>device 侧不静默 clamp 非法 position；非法 position 会通过 safe masked load 写出 NaN，使非法输入 fail loudly。</w:t>
-      </w:r>
-    </w:p>
-    <w:p>
-      <w:r>
-        <w:t>contiguity 是 Triton-Ascend 实现 guard，不是对 docs/mrope.md 语义合同的收窄。</w:t>
-      </w:r>
-    </w:p>
-    <w:p>
-      <w:r>
-        <w:rPr>
-          <w:b/>
-          <w:sz w:val="28"/>
-        </w:rPr>
-        <w:t>6. 性能与验证证据</w:t>
-      </w:r>
-    </w:p>
-    <w:p>
-      <w:r>
-        <w:t>当前交付采用边界修复后的 latest full-public run eval_20260617_151008：20/20 PASS，active_vs_active.geomean=11.657673x，min=1.146341x，score=100.018425。</w:t>
-      </w:r>
-    </w:p>
-    <w:p>
-      <w:r>
-        <w:t>baseline split 为 task_npu_baseline=8、pytorch_fallback=12；不能将 pytorch_fallback case 表述为有效 CANN npu_mrope baseline 加速。</w:t>
-      </w:r>
-    </w:p>
-    <w:p>
-      <w:r>
-        <w:t>本目录实际运行 validate_mrope.py：public=20、random=40、总计 60/60 PASS，mismatch=0。</w:t>
-      </w:r>
-    </w:p>
-    <w:p>
-      <w:r>
-        <w:rPr>
-          <w:b/>
-          <w:sz w:val="28"/>
-        </w:rPr>
-        <w:t>7. 已知限制</w:t>
-      </w:r>
-    </w:p>
-    <w:p>
-      <w:r>
-        <w:t>若评审按逐 case &gt;1.2x CANN 算子解释性能要求，当前有 4 个 task_npu_baseline case 低于 1.2x；若按整体 geomean 解释，则当前整体满足。</w:t>
-      </w:r>
-    </w:p>
-    <w:p>
-      <w:r>
-        <w:t>standalone PipeUtilization.csv 仍缺失，但 current profile_analysis 已从 ascend_pytorch_profiler.db 解出 pipeline 覆盖；本文档不做 VEC/MTE/SCALAR/CUBE 瓶颈归因。</w:t>
-      </w:r>
-    </w:p>
-    <w:p>
-      <w:r>
-        <w:rPr>
-          <w:b/>
-          <w:sz w:val="28"/>
-        </w:rPr>
-        <w:t>8. Public 逐项速度摘要</w:t>
+        <w:t>Torch 和 torch_npu baseline 均由本目录 run_inference.py 生成；torch_npu 只有运行成功且精度通过时才被选为 selected baseline；不读取或保留外部历史对照文件。</w:t>
       </w:r>
     </w:p>
     <w:tbl>
@@ -185,71 +94,27 @@
         <w:tblLook w:firstColumn="1" w:firstRow="1" w:lastColumn="0" w:lastRow="0" w:noHBand="0" w:noVBand="1" w:val="04A0"/>
       </w:tblPr>
       <w:tblGrid>
-        <w:gridCol w:w="1384"/>
-        <w:gridCol w:w="1384"/>
-        <w:gridCol w:w="1384"/>
-        <w:gridCol w:w="1384"/>
-        <w:gridCol w:w="1384"/>
-        <w:gridCol w:w="1384"/>
+        <w:gridCol w:w="4153"/>
+        <w:gridCol w:w="4153"/>
       </w:tblGrid>
       <w:tr>
         <w:tc>
           <w:tcPr>
-            <w:tcW w:type="dxa" w:w="1384"/>
-          </w:tcPr>
-          <w:p>
-            <w:r>
-              <w:t>Case</w:t>
-            </w:r>
-          </w:p>
-        </w:tc>
-        <w:tc>
-          <w:tcPr>
-            <w:tcW w:type="dxa" w:w="1384"/>
-          </w:tcPr>
-          <w:p>
-            <w:r>
-              <w:t>Baseline</w:t>
-            </w:r>
-          </w:p>
-        </w:tc>
-        <w:tc>
-          <w:tcPr>
-            <w:tcW w:type="dxa" w:w="1384"/>
-          </w:tcPr>
-          <w:p>
-            <w:r>
-              <w:t>Triton active</w:t>
-            </w:r>
-          </w:p>
-        </w:tc>
-        <w:tc>
-          <w:tcPr>
-            <w:tcW w:type="dxa" w:w="1384"/>
-          </w:tcPr>
-          <w:p>
-            <w:r>
-              <w:t>Baseline active</w:t>
-            </w:r>
-          </w:p>
-        </w:tc>
-        <w:tc>
-          <w:tcPr>
-            <w:tcW w:type="dxa" w:w="1384"/>
-          </w:tcPr>
-          <w:p>
-            <w:r>
-              <w:t>active/active</w:t>
-            </w:r>
-          </w:p>
-        </w:tc>
-        <w:tc>
-          <w:tcPr>
-            <w:tcW w:type="dxa" w:w="1384"/>
-          </w:tcPr>
-          <w:p>
-            <w:r>
-              <w:t>Mismatch</w:t>
+            <w:tcW w:type="dxa" w:w="4153"/>
+          </w:tcPr>
+          <w:p>
+            <w:r>
+              <w:t>指标</w:t>
+            </w:r>
+          </w:p>
+        </w:tc>
+        <w:tc>
+          <w:tcPr>
+            <w:tcW w:type="dxa" w:w="4153"/>
+          </w:tcPr>
+          <w:p>
+            <w:r>
+              <w:t>数值</w:t>
             </w:r>
           </w:p>
         </w:tc>
@@ -257,61 +122,21 @@
       <w:tr>
         <w:tc>
           <w:tcPr>
-            <w:tcW w:type="dxa" w:w="1384"/>
-          </w:tcPr>
-          <w:p>
-            <w:r>
-              <w:t>custom/mrope_1</w:t>
-            </w:r>
-          </w:p>
-        </w:tc>
-        <w:tc>
-          <w:tcPr>
-            <w:tcW w:type="dxa" w:w="1384"/>
-          </w:tcPr>
-          <w:p>
-            <w:r>
-              <w:t>pytorch_fallback</w:t>
-            </w:r>
-          </w:p>
-        </w:tc>
-        <w:tc>
-          <w:tcPr>
-            <w:tcW w:type="dxa" w:w="1384"/>
-          </w:tcPr>
-          <w:p>
-            <w:r>
-              <w:t>4.000 us</w:t>
-            </w:r>
-          </w:p>
-        </w:tc>
-        <w:tc>
-          <w:tcPr>
-            <w:tcW w:type="dxa" w:w="1384"/>
-          </w:tcPr>
-          <w:p>
-            <w:r>
-              <w:t>845.500 us</w:t>
-            </w:r>
-          </w:p>
-        </w:tc>
-        <w:tc>
-          <w:tcPr>
-            <w:tcW w:type="dxa" w:w="1384"/>
-          </w:tcPr>
-          <w:p>
-            <w:r>
-              <w:t>211.375000x</w:t>
-            </w:r>
-          </w:p>
-        </w:tc>
-        <w:tc>
-          <w:tcPr>
-            <w:tcW w:type="dxa" w:w="1384"/>
-          </w:tcPr>
-          <w:p>
-            <w:r>
-              <w:t>0</w:t>
+            <w:tcW w:type="dxa" w:w="4153"/>
+          </w:tcPr>
+          <w:p>
+            <w:r>
+              <w:t>evidence source</w:t>
+            </w:r>
+          </w:p>
+        </w:tc>
+        <w:tc>
+          <w:tcPr>
+            <w:tcW w:type="dxa" w:w="4153"/>
+          </w:tcPr>
+          <w:p>
+            <w:r>
+              <w:t>logs/mrope_validation.jsonl</w:t>
             </w:r>
           </w:p>
         </w:tc>
@@ -319,61 +144,21 @@
       <w:tr>
         <w:tc>
           <w:tcPr>
-            <w:tcW w:type="dxa" w:w="1384"/>
-          </w:tcPr>
-          <w:p>
-            <w:r>
-              <w:t>custom/mrope_2</w:t>
-            </w:r>
-          </w:p>
-        </w:tc>
-        <w:tc>
-          <w:tcPr>
-            <w:tcW w:type="dxa" w:w="1384"/>
-          </w:tcPr>
-          <w:p>
-            <w:r>
-              <w:t>task_npu_baseline</w:t>
-            </w:r>
-          </w:p>
-        </w:tc>
-        <w:tc>
-          <w:tcPr>
-            <w:tcW w:type="dxa" w:w="1384"/>
-          </w:tcPr>
-          <w:p>
-            <w:r>
-              <w:t>8.250 us</w:t>
-            </w:r>
-          </w:p>
-        </w:tc>
-        <w:tc>
-          <w:tcPr>
-            <w:tcW w:type="dxa" w:w="1384"/>
-          </w:tcPr>
-          <w:p>
-            <w:r>
-              <w:t>9.500 us</w:t>
-            </w:r>
-          </w:p>
-        </w:tc>
-        <w:tc>
-          <w:tcPr>
-            <w:tcW w:type="dxa" w:w="1384"/>
-          </w:tcPr>
-          <w:p>
-            <w:r>
-              <w:t>1.151515x</w:t>
-            </w:r>
-          </w:p>
-        </w:tc>
-        <w:tc>
-          <w:tcPr>
-            <w:tcW w:type="dxa" w:w="1384"/>
-          </w:tcPr>
-          <w:p>
-            <w:r>
-              <w:t>0</w:t>
+            <w:tcW w:type="dxa" w:w="4153"/>
+          </w:tcPr>
+          <w:p>
+            <w:r>
+              <w:t>total cases</w:t>
+            </w:r>
+          </w:p>
+        </w:tc>
+        <w:tc>
+          <w:tcPr>
+            <w:tcW w:type="dxa" w:w="4153"/>
+          </w:tcPr>
+          <w:p>
+            <w:r>
+              <w:t>60</w:t>
             </w:r>
           </w:p>
         </w:tc>
@@ -381,61 +166,21 @@
       <w:tr>
         <w:tc>
           <w:tcPr>
-            <w:tcW w:type="dxa" w:w="1384"/>
-          </w:tcPr>
-          <w:p>
-            <w:r>
-              <w:t>custom/mrope_3</w:t>
-            </w:r>
-          </w:p>
-        </w:tc>
-        <w:tc>
-          <w:tcPr>
-            <w:tcW w:type="dxa" w:w="1384"/>
-          </w:tcPr>
-          <w:p>
-            <w:r>
-              <w:t>pytorch_fallback</w:t>
-            </w:r>
-          </w:p>
-        </w:tc>
-        <w:tc>
-          <w:tcPr>
-            <w:tcW w:type="dxa" w:w="1384"/>
-          </w:tcPr>
-          <w:p>
-            <w:r>
-              <w:t>7.250 us</w:t>
-            </w:r>
-          </w:p>
-        </w:tc>
-        <w:tc>
-          <w:tcPr>
-            <w:tcW w:type="dxa" w:w="1384"/>
-          </w:tcPr>
-          <w:p>
-            <w:r>
-              <w:t>1052.000 us</w:t>
-            </w:r>
-          </w:p>
-        </w:tc>
-        <w:tc>
-          <w:tcPr>
-            <w:tcW w:type="dxa" w:w="1384"/>
-          </w:tcPr>
-          <w:p>
-            <w:r>
-              <w:t>145.103448x</w:t>
-            </w:r>
-          </w:p>
-        </w:tc>
-        <w:tc>
-          <w:tcPr>
-            <w:tcW w:type="dxa" w:w="1384"/>
-          </w:tcPr>
-          <w:p>
-            <w:r>
-              <w:t>0</w:t>
+            <w:tcW w:type="dxa" w:w="4153"/>
+          </w:tcPr>
+          <w:p>
+            <w:r>
+              <w:t>public cases</w:t>
+            </w:r>
+          </w:p>
+        </w:tc>
+        <w:tc>
+          <w:tcPr>
+            <w:tcW w:type="dxa" w:w="4153"/>
+          </w:tcPr>
+          <w:p>
+            <w:r>
+              <w:t>20</w:t>
             </w:r>
           </w:p>
         </w:tc>
@@ -443,61 +188,21 @@
       <w:tr>
         <w:tc>
           <w:tcPr>
-            <w:tcW w:type="dxa" w:w="1384"/>
-          </w:tcPr>
-          <w:p>
-            <w:r>
-              <w:t>custom/mrope_4</w:t>
-            </w:r>
-          </w:p>
-        </w:tc>
-        <w:tc>
-          <w:tcPr>
-            <w:tcW w:type="dxa" w:w="1384"/>
-          </w:tcPr>
-          <w:p>
-            <w:r>
-              <w:t>task_npu_baseline</w:t>
-            </w:r>
-          </w:p>
-        </w:tc>
-        <w:tc>
-          <w:tcPr>
-            <w:tcW w:type="dxa" w:w="1384"/>
-          </w:tcPr>
-          <w:p>
-            <w:r>
-              <w:t>8.250 us</w:t>
-            </w:r>
-          </w:p>
-        </w:tc>
-        <w:tc>
-          <w:tcPr>
-            <w:tcW w:type="dxa" w:w="1384"/>
-          </w:tcPr>
-          <w:p>
-            <w:r>
-              <w:t>14.250 us</w:t>
-            </w:r>
-          </w:p>
-        </w:tc>
-        <w:tc>
-          <w:tcPr>
-            <w:tcW w:type="dxa" w:w="1384"/>
-          </w:tcPr>
-          <w:p>
-            <w:r>
-              <w:t>1.727273x</w:t>
-            </w:r>
-          </w:p>
-        </w:tc>
-        <w:tc>
-          <w:tcPr>
-            <w:tcW w:type="dxa" w:w="1384"/>
-          </w:tcPr>
-          <w:p>
-            <w:r>
-              <w:t>0</w:t>
+            <w:tcW w:type="dxa" w:w="4153"/>
+          </w:tcPr>
+          <w:p>
+            <w:r>
+              <w:t>random/generalization cases</w:t>
+            </w:r>
+          </w:p>
+        </w:tc>
+        <w:tc>
+          <w:tcPr>
+            <w:tcW w:type="dxa" w:w="4153"/>
+          </w:tcPr>
+          <w:p>
+            <w:r>
+              <w:t>40</w:t>
             </w:r>
           </w:p>
         </w:tc>
@@ -505,61 +210,21 @@
       <w:tr>
         <w:tc>
           <w:tcPr>
-            <w:tcW w:type="dxa" w:w="1384"/>
-          </w:tcPr>
-          <w:p>
-            <w:r>
-              <w:t>custom/mrope_5</w:t>
-            </w:r>
-          </w:p>
-        </w:tc>
-        <w:tc>
-          <w:tcPr>
-            <w:tcW w:type="dxa" w:w="1384"/>
-          </w:tcPr>
-          <w:p>
-            <w:r>
-              <w:t>pytorch_fallback</w:t>
-            </w:r>
-          </w:p>
-        </w:tc>
-        <w:tc>
-          <w:tcPr>
-            <w:tcW w:type="dxa" w:w="1384"/>
-          </w:tcPr>
-          <w:p>
-            <w:r>
-              <w:t>13.000 us</w:t>
-            </w:r>
-          </w:p>
-        </w:tc>
-        <w:tc>
-          <w:tcPr>
-            <w:tcW w:type="dxa" w:w="1384"/>
-          </w:tcPr>
-          <w:p>
-            <w:r>
-              <w:t>1298.250 us</w:t>
-            </w:r>
-          </w:p>
-        </w:tc>
-        <w:tc>
-          <w:tcPr>
-            <w:tcW w:type="dxa" w:w="1384"/>
-          </w:tcPr>
-          <w:p>
-            <w:r>
-              <w:t>99.865385x</w:t>
-            </w:r>
-          </w:p>
-        </w:tc>
-        <w:tc>
-          <w:tcPr>
-            <w:tcW w:type="dxa" w:w="1384"/>
-          </w:tcPr>
-          <w:p>
-            <w:r>
-              <w:t>0</w:t>
+            <w:tcW w:type="dxa" w:w="4153"/>
+          </w:tcPr>
+          <w:p>
+            <w:r>
+              <w:t>candidate pass</w:t>
+            </w:r>
+          </w:p>
+        </w:tc>
+        <w:tc>
+          <w:tcPr>
+            <w:tcW w:type="dxa" w:w="4153"/>
+          </w:tcPr>
+          <w:p>
+            <w:r>
+              <w:t>60/60</w:t>
             </w:r>
           </w:p>
         </w:tc>
@@ -567,61 +232,21 @@
       <w:tr>
         <w:tc>
           <w:tcPr>
-            <w:tcW w:type="dxa" w:w="1384"/>
-          </w:tcPr>
-          <w:p>
-            <w:r>
-              <w:t>custom/mrope_6</w:t>
-            </w:r>
-          </w:p>
-        </w:tc>
-        <w:tc>
-          <w:tcPr>
-            <w:tcW w:type="dxa" w:w="1384"/>
-          </w:tcPr>
-          <w:p>
-            <w:r>
-              <w:t>pytorch_fallback</w:t>
-            </w:r>
-          </w:p>
-        </w:tc>
-        <w:tc>
-          <w:tcPr>
-            <w:tcW w:type="dxa" w:w="1384"/>
-          </w:tcPr>
-          <w:p>
-            <w:r>
-              <w:t>8.000 us</w:t>
-            </w:r>
-          </w:p>
-        </w:tc>
-        <w:tc>
-          <w:tcPr>
-            <w:tcW w:type="dxa" w:w="1384"/>
-          </w:tcPr>
-          <w:p>
-            <w:r>
-              <w:t>914.000 us</w:t>
-            </w:r>
-          </w:p>
-        </w:tc>
-        <w:tc>
-          <w:tcPr>
-            <w:tcW w:type="dxa" w:w="1384"/>
-          </w:tcPr>
-          <w:p>
-            <w:r>
-              <w:t>114.250000x</w:t>
-            </w:r>
-          </w:p>
-        </w:tc>
-        <w:tc>
-          <w:tcPr>
-            <w:tcW w:type="dxa" w:w="1384"/>
-          </w:tcPr>
-          <w:p>
-            <w:r>
-              <w:t>0</w:t>
+            <w:tcW w:type="dxa" w:w="4153"/>
+          </w:tcPr>
+          <w:p>
+            <w:r>
+              <w:t>main speed sample</w:t>
+            </w:r>
+          </w:p>
+        </w:tc>
+        <w:tc>
+          <w:tcPr>
+            <w:tcW w:type="dxa" w:w="4153"/>
+          </w:tcPr>
+          <w:p>
+            <w:r>
+              <w:t>torch_npu runnable all (31 cases)</w:t>
             </w:r>
           </w:p>
         </w:tc>
@@ -629,61 +254,21 @@
       <w:tr>
         <w:tc>
           <w:tcPr>
-            <w:tcW w:type="dxa" w:w="1384"/>
-          </w:tcPr>
-          <w:p>
-            <w:r>
-              <w:t>custom/mrope_7</w:t>
-            </w:r>
-          </w:p>
-        </w:tc>
-        <w:tc>
-          <w:tcPr>
-            <w:tcW w:type="dxa" w:w="1384"/>
-          </w:tcPr>
-          <w:p>
-            <w:r>
-              <w:t>task_npu_baseline</w:t>
-            </w:r>
-          </w:p>
-        </w:tc>
-        <w:tc>
-          <w:tcPr>
-            <w:tcW w:type="dxa" w:w="1384"/>
-          </w:tcPr>
-          <w:p>
-            <w:r>
-              <w:t>9.250 us</w:t>
-            </w:r>
-          </w:p>
-        </w:tc>
-        <w:tc>
-          <w:tcPr>
-            <w:tcW w:type="dxa" w:w="1384"/>
-          </w:tcPr>
-          <w:p>
-            <w:r>
-              <w:t>10.750 us</w:t>
-            </w:r>
-          </w:p>
-        </w:tc>
-        <w:tc>
-          <w:tcPr>
-            <w:tcW w:type="dxa" w:w="1384"/>
-          </w:tcPr>
-          <w:p>
-            <w:r>
-              <w:t>1.162162x</w:t>
-            </w:r>
-          </w:p>
-        </w:tc>
-        <w:tc>
-          <w:tcPr>
-            <w:tcW w:type="dxa" w:w="1384"/>
-          </w:tcPr>
-          <w:p>
-            <w:r>
-              <w:t>0</w:t>
+            <w:tcW w:type="dxa" w:w="4153"/>
+          </w:tcPr>
+          <w:p>
+            <w:r>
+              <w:t>main speed candidate active geomean</w:t>
+            </w:r>
+          </w:p>
+        </w:tc>
+        <w:tc>
+          <w:tcPr>
+            <w:tcW w:type="dxa" w:w="4153"/>
+          </w:tcPr>
+          <w:p>
+            <w:r>
+              <w:t>11.271 us</w:t>
             </w:r>
           </w:p>
         </w:tc>
@@ -691,61 +276,21 @@
       <w:tr>
         <w:tc>
           <w:tcPr>
-            <w:tcW w:type="dxa" w:w="1384"/>
-          </w:tcPr>
-          <w:p>
-            <w:r>
-              <w:t>custom/mrope_8</w:t>
-            </w:r>
-          </w:p>
-        </w:tc>
-        <w:tc>
-          <w:tcPr>
-            <w:tcW w:type="dxa" w:w="1384"/>
-          </w:tcPr>
-          <w:p>
-            <w:r>
-              <w:t>pytorch_fallback</w:t>
-            </w:r>
-          </w:p>
-        </w:tc>
-        <w:tc>
-          <w:tcPr>
-            <w:tcW w:type="dxa" w:w="1384"/>
-          </w:tcPr>
-          <w:p>
-            <w:r>
-              <w:t>23.000 us</w:t>
-            </w:r>
-          </w:p>
-        </w:tc>
-        <w:tc>
-          <w:tcPr>
-            <w:tcW w:type="dxa" w:w="1384"/>
-          </w:tcPr>
-          <w:p>
-            <w:r>
-              <w:t>1221.750 us</w:t>
-            </w:r>
-          </w:p>
-        </w:tc>
-        <w:tc>
-          <w:tcPr>
-            <w:tcW w:type="dxa" w:w="1384"/>
-          </w:tcPr>
-          <w:p>
-            <w:r>
-              <w:t>53.119565x</w:t>
-            </w:r>
-          </w:p>
-        </w:tc>
-        <w:tc>
-          <w:tcPr>
-            <w:tcW w:type="dxa" w:w="1384"/>
-          </w:tcPr>
-          <w:p>
-            <w:r>
-              <w:t>0</w:t>
+            <w:tcW w:type="dxa" w:w="4153"/>
+          </w:tcPr>
+          <w:p>
+            <w:r>
+              <w:t>main speed torch_npu active geomean</w:t>
+            </w:r>
+          </w:p>
+        </w:tc>
+        <w:tc>
+          <w:tcPr>
+            <w:tcW w:type="dxa" w:w="4153"/>
+          </w:tcPr>
+          <w:p>
+            <w:r>
+              <w:t>13.765 us</w:t>
             </w:r>
           </w:p>
         </w:tc>
@@ -753,61 +298,21 @@
       <w:tr>
         <w:tc>
           <w:tcPr>
-            <w:tcW w:type="dxa" w:w="1384"/>
-          </w:tcPr>
-          <w:p>
-            <w:r>
-              <w:t>custom/mrope_9</w:t>
-            </w:r>
-          </w:p>
-        </w:tc>
-        <w:tc>
-          <w:tcPr>
-            <w:tcW w:type="dxa" w:w="1384"/>
-          </w:tcPr>
-          <w:p>
-            <w:r>
-              <w:t>task_npu_baseline</w:t>
-            </w:r>
-          </w:p>
-        </w:tc>
-        <w:tc>
-          <w:tcPr>
-            <w:tcW w:type="dxa" w:w="1384"/>
-          </w:tcPr>
-          <w:p>
-            <w:r>
-              <w:t>10.250 us</w:t>
-            </w:r>
-          </w:p>
-        </w:tc>
-        <w:tc>
-          <w:tcPr>
-            <w:tcW w:type="dxa" w:w="1384"/>
-          </w:tcPr>
-          <w:p>
-            <w:r>
-              <w:t>11.750 us</w:t>
-            </w:r>
-          </w:p>
-        </w:tc>
-        <w:tc>
-          <w:tcPr>
-            <w:tcW w:type="dxa" w:w="1384"/>
-          </w:tcPr>
-          <w:p>
-            <w:r>
-              <w:t>1.146341x</w:t>
-            </w:r>
-          </w:p>
-        </w:tc>
-        <w:tc>
-          <w:tcPr>
-            <w:tcW w:type="dxa" w:w="1384"/>
-          </w:tcPr>
-          <w:p>
-            <w:r>
-              <w:t>0</w:t>
+            <w:tcW w:type="dxa" w:w="4153"/>
+          </w:tcPr>
+          <w:p>
+            <w:r>
+              <w:t>main speed active/active geomean speedup</w:t>
+            </w:r>
+          </w:p>
+        </w:tc>
+        <w:tc>
+          <w:tcPr>
+            <w:tcW w:type="dxa" w:w="4153"/>
+          </w:tcPr>
+          <w:p>
+            <w:r>
+              <w:t>1.211017x</w:t>
             </w:r>
           </w:p>
         </w:tc>
@@ -815,61 +320,21 @@
       <w:tr>
         <w:tc>
           <w:tcPr>
-            <w:tcW w:type="dxa" w:w="1384"/>
-          </w:tcPr>
-          <w:p>
-            <w:r>
-              <w:t>custom/mrope_10</w:t>
-            </w:r>
-          </w:p>
-        </w:tc>
-        <w:tc>
-          <w:tcPr>
-            <w:tcW w:type="dxa" w:w="1384"/>
-          </w:tcPr>
-          <w:p>
-            <w:r>
-              <w:t>pytorch_fallback</w:t>
-            </w:r>
-          </w:p>
-        </w:tc>
-        <w:tc>
-          <w:tcPr>
-            <w:tcW w:type="dxa" w:w="1384"/>
-          </w:tcPr>
-          <w:p>
-            <w:r>
-              <w:t>18.250 us</w:t>
-            </w:r>
-          </w:p>
-        </w:tc>
-        <w:tc>
-          <w:tcPr>
-            <w:tcW w:type="dxa" w:w="1384"/>
-          </w:tcPr>
-          <w:p>
-            <w:r>
-              <w:t>1210.500 us</w:t>
-            </w:r>
-          </w:p>
-        </w:tc>
-        <w:tc>
-          <w:tcPr>
-            <w:tcW w:type="dxa" w:w="1384"/>
-          </w:tcPr>
-          <w:p>
-            <w:r>
-              <w:t>66.328767x</w:t>
-            </w:r>
-          </w:p>
-        </w:tc>
-        <w:tc>
-          <w:tcPr>
-            <w:tcW w:type="dxa" w:w="1384"/>
-          </w:tcPr>
-          <w:p>
-            <w:r>
-              <w:t>0</w:t>
+            <w:tcW w:type="dxa" w:w="4153"/>
+          </w:tcPr>
+          <w:p>
+            <w:r>
+              <w:t>main speed gate</w:t>
+            </w:r>
+          </w:p>
+        </w:tc>
+        <w:tc>
+          <w:tcPr>
+            <w:tcW w:type="dxa" w:w="4153"/>
+          </w:tcPr>
+          <w:p>
+            <w:r>
+              <w:t>PASS &gt;= 1.2x</w:t>
             </w:r>
           </w:p>
         </w:tc>
@@ -877,61 +342,21 @@
       <w:tr>
         <w:tc>
           <w:tcPr>
-            <w:tcW w:type="dxa" w:w="1384"/>
-          </w:tcPr>
-          <w:p>
-            <w:r>
-              <w:t>custom/mrope_11</w:t>
-            </w:r>
-          </w:p>
-        </w:tc>
-        <w:tc>
-          <w:tcPr>
-            <w:tcW w:type="dxa" w:w="1384"/>
-          </w:tcPr>
-          <w:p>
-            <w:r>
-              <w:t>pytorch_fallback</w:t>
-            </w:r>
-          </w:p>
-        </w:tc>
-        <w:tc>
-          <w:tcPr>
-            <w:tcW w:type="dxa" w:w="1384"/>
-          </w:tcPr>
-          <w:p>
-            <w:r>
-              <w:t>14.750 us</w:t>
-            </w:r>
-          </w:p>
-        </w:tc>
-        <w:tc>
-          <w:tcPr>
-            <w:tcW w:type="dxa" w:w="1384"/>
-          </w:tcPr>
-          <w:p>
-            <w:r>
-              <w:t>912.250 us</w:t>
-            </w:r>
-          </w:p>
-        </w:tc>
-        <w:tc>
-          <w:tcPr>
-            <w:tcW w:type="dxa" w:w="1384"/>
-          </w:tcPr>
-          <w:p>
-            <w:r>
-              <w:t>61.847458x</w:t>
-            </w:r>
-          </w:p>
-        </w:tc>
-        <w:tc>
-          <w:tcPr>
-            <w:tcW w:type="dxa" w:w="1384"/>
-          </w:tcPr>
-          <w:p>
-            <w:r>
-              <w:t>0</w:t>
+            <w:tcW w:type="dxa" w:w="4153"/>
+          </w:tcPr>
+          <w:p>
+            <w:r>
+              <w:t>overall selected baseline split</w:t>
+            </w:r>
+          </w:p>
+        </w:tc>
+        <w:tc>
+          <w:tcPr>
+            <w:tcW w:type="dxa" w:w="4153"/>
+          </w:tcPr>
+          <w:p>
+            <w:r>
+              <w:t>torch=28, torch_npu=32</w:t>
             </w:r>
           </w:p>
         </w:tc>
@@ -939,61 +364,21 @@
       <w:tr>
         <w:tc>
           <w:tcPr>
-            <w:tcW w:type="dxa" w:w="1384"/>
-          </w:tcPr>
-          <w:p>
-            <w:r>
-              <w:t>custom/mrope_12</w:t>
-            </w:r>
-          </w:p>
-        </w:tc>
-        <w:tc>
-          <w:tcPr>
-            <w:tcW w:type="dxa" w:w="1384"/>
-          </w:tcPr>
-          <w:p>
-            <w:r>
-              <w:t>task_npu_baseline</w:t>
-            </w:r>
-          </w:p>
-        </w:tc>
-        <w:tc>
-          <w:tcPr>
-            <w:tcW w:type="dxa" w:w="1384"/>
-          </w:tcPr>
-          <w:p>
-            <w:r>
-              <w:t>9.750 us</w:t>
-            </w:r>
-          </w:p>
-        </w:tc>
-        <w:tc>
-          <w:tcPr>
-            <w:tcW w:type="dxa" w:w="1384"/>
-          </w:tcPr>
-          <w:p>
-            <w:r>
-              <w:t>16.500 us</w:t>
-            </w:r>
-          </w:p>
-        </w:tc>
-        <w:tc>
-          <w:tcPr>
-            <w:tcW w:type="dxa" w:w="1384"/>
-          </w:tcPr>
-          <w:p>
-            <w:r>
-              <w:t>1.692308x</w:t>
-            </w:r>
-          </w:p>
-        </w:tc>
-        <w:tc>
-          <w:tcPr>
-            <w:tcW w:type="dxa" w:w="1384"/>
-          </w:tcPr>
-          <w:p>
-            <w:r>
-              <w:t>0</w:t>
+            <w:tcW w:type="dxa" w:w="4153"/>
+          </w:tcPr>
+          <w:p>
+            <w:r>
+              <w:t>public selected baseline split</w:t>
+            </w:r>
+          </w:p>
+        </w:tc>
+        <w:tc>
+          <w:tcPr>
+            <w:tcW w:type="dxa" w:w="4153"/>
+          </w:tcPr>
+          <w:p>
+            <w:r>
+              <w:t>torch=8, torch_npu=12</w:t>
             </w:r>
           </w:p>
         </w:tc>
@@ -1001,61 +386,21 @@
       <w:tr>
         <w:tc>
           <w:tcPr>
-            <w:tcW w:type="dxa" w:w="1384"/>
-          </w:tcPr>
-          <w:p>
-            <w:r>
-              <w:t>custom/mrope_13</w:t>
-            </w:r>
-          </w:p>
-        </w:tc>
-        <w:tc>
-          <w:tcPr>
-            <w:tcW w:type="dxa" w:w="1384"/>
-          </w:tcPr>
-          <w:p>
-            <w:r>
-              <w:t>pytorch_fallback</w:t>
-            </w:r>
-          </w:p>
-        </w:tc>
-        <w:tc>
-          <w:tcPr>
-            <w:tcW w:type="dxa" w:w="1384"/>
-          </w:tcPr>
-          <w:p>
-            <w:r>
-              <w:t>34.250 us</w:t>
-            </w:r>
-          </w:p>
-        </w:tc>
-        <w:tc>
-          <w:tcPr>
-            <w:tcW w:type="dxa" w:w="1384"/>
-          </w:tcPr>
-          <w:p>
-            <w:r>
-              <w:t>1043.500 us</w:t>
-            </w:r>
-          </w:p>
-        </w:tc>
-        <w:tc>
-          <w:tcPr>
-            <w:tcW w:type="dxa" w:w="1384"/>
-          </w:tcPr>
-          <w:p>
-            <w:r>
-              <w:t>30.467153x</w:t>
-            </w:r>
-          </w:p>
-        </w:tc>
-        <w:tc>
-          <w:tcPr>
-            <w:tcW w:type="dxa" w:w="1384"/>
-          </w:tcPr>
-          <w:p>
-            <w:r>
-              <w:t>0</w:t>
+            <w:tcW w:type="dxa" w:w="4153"/>
+          </w:tcPr>
+          <w:p>
+            <w:r>
+              <w:t>overall torch_npu runnable all</w:t>
+            </w:r>
+          </w:p>
+        </w:tc>
+        <w:tc>
+          <w:tcPr>
+            <w:tcW w:type="dxa" w:w="4153"/>
+          </w:tcPr>
+          <w:p>
+            <w:r>
+              <w:t>31</w:t>
             </w:r>
           </w:p>
         </w:tc>
@@ -1063,61 +408,21 @@
       <w:tr>
         <w:tc>
           <w:tcPr>
-            <w:tcW w:type="dxa" w:w="1384"/>
-          </w:tcPr>
-          <w:p>
-            <w:r>
-              <w:t>custom/mrope_14</w:t>
-            </w:r>
-          </w:p>
-        </w:tc>
-        <w:tc>
-          <w:tcPr>
-            <w:tcW w:type="dxa" w:w="1384"/>
-          </w:tcPr>
-          <w:p>
-            <w:r>
-              <w:t>task_npu_baseline</w:t>
-            </w:r>
-          </w:p>
-        </w:tc>
-        <w:tc>
-          <w:tcPr>
-            <w:tcW w:type="dxa" w:w="1384"/>
-          </w:tcPr>
-          <w:p>
-            <w:r>
-              <w:t>10.500 us</w:t>
-            </w:r>
-          </w:p>
-        </w:tc>
-        <w:tc>
-          <w:tcPr>
-            <w:tcW w:type="dxa" w:w="1384"/>
-          </w:tcPr>
-          <w:p>
-            <w:r>
-              <w:t>16.500 us</w:t>
-            </w:r>
-          </w:p>
-        </w:tc>
-        <w:tc>
-          <w:tcPr>
-            <w:tcW w:type="dxa" w:w="1384"/>
-          </w:tcPr>
-          <w:p>
-            <w:r>
-              <w:t>1.571429x</w:t>
-            </w:r>
-          </w:p>
-        </w:tc>
-        <w:tc>
-          <w:tcPr>
-            <w:tcW w:type="dxa" w:w="1384"/>
-          </w:tcPr>
-          <w:p>
-            <w:r>
-              <w:t>0</w:t>
+            <w:tcW w:type="dxa" w:w="4153"/>
+          </w:tcPr>
+          <w:p>
+            <w:r>
+              <w:t>overall torch_npu accuracy pass/fail</w:t>
+            </w:r>
+          </w:p>
+        </w:tc>
+        <w:tc>
+          <w:tcPr>
+            <w:tcW w:type="dxa" w:w="4153"/>
+          </w:tcPr>
+          <w:p>
+            <w:r>
+              <w:t>31/0</w:t>
             </w:r>
           </w:p>
         </w:tc>
@@ -1125,61 +430,21 @@
       <w:tr>
         <w:tc>
           <w:tcPr>
-            <w:tcW w:type="dxa" w:w="1384"/>
-          </w:tcPr>
-          <w:p>
-            <w:r>
-              <w:t>custom/mrope_15</w:t>
-            </w:r>
-          </w:p>
-        </w:tc>
-        <w:tc>
-          <w:tcPr>
-            <w:tcW w:type="dxa" w:w="1384"/>
-          </w:tcPr>
-          <w:p>
-            <w:r>
-              <w:t>pytorch_fallback</w:t>
-            </w:r>
-          </w:p>
-        </w:tc>
-        <w:tc>
-          <w:tcPr>
-            <w:tcW w:type="dxa" w:w="1384"/>
-          </w:tcPr>
-          <w:p>
-            <w:r>
-              <w:t>30.250 us</w:t>
-            </w:r>
-          </w:p>
-        </w:tc>
-        <w:tc>
-          <w:tcPr>
-            <w:tcW w:type="dxa" w:w="1384"/>
-          </w:tcPr>
-          <w:p>
-            <w:r>
-              <w:t>963.000 us</w:t>
-            </w:r>
-          </w:p>
-        </w:tc>
-        <w:tc>
-          <w:tcPr>
-            <w:tcW w:type="dxa" w:w="1384"/>
-          </w:tcPr>
-          <w:p>
-            <w:r>
-              <w:t>31.834711x</w:t>
-            </w:r>
-          </w:p>
-        </w:tc>
-        <w:tc>
-          <w:tcPr>
-            <w:tcW w:type="dxa" w:w="1384"/>
-          </w:tcPr>
-          <w:p>
-            <w:r>
-              <w:t>0</w:t>
+            <w:tcW w:type="dxa" w:w="4153"/>
+          </w:tcPr>
+          <w:p>
+            <w:r>
+              <w:t>torch_npu runnable-all active speedup geomean</w:t>
+            </w:r>
+          </w:p>
+        </w:tc>
+        <w:tc>
+          <w:tcPr>
+            <w:tcW w:type="dxa" w:w="4153"/>
+          </w:tcPr>
+          <w:p>
+            <w:r>
+              <w:t>1.211017x</w:t>
             </w:r>
           </w:p>
         </w:tc>
@@ -1187,61 +452,21 @@
       <w:tr>
         <w:tc>
           <w:tcPr>
-            <w:tcW w:type="dxa" w:w="1384"/>
-          </w:tcPr>
-          <w:p>
-            <w:r>
-              <w:t>custom/mrope_16</w:t>
-            </w:r>
-          </w:p>
-        </w:tc>
-        <w:tc>
-          <w:tcPr>
-            <w:tcW w:type="dxa" w:w="1384"/>
-          </w:tcPr>
-          <w:p>
-            <w:r>
-              <w:t>pytorch_fallback</w:t>
-            </w:r>
-          </w:p>
-        </w:tc>
-        <w:tc>
-          <w:tcPr>
-            <w:tcW w:type="dxa" w:w="1384"/>
-          </w:tcPr>
-          <w:p>
-            <w:r>
-              <w:t>39.250 us</w:t>
-            </w:r>
-          </w:p>
-        </w:tc>
-        <w:tc>
-          <w:tcPr>
-            <w:tcW w:type="dxa" w:w="1384"/>
-          </w:tcPr>
-          <w:p>
-            <w:r>
-              <w:t>721.500 us</w:t>
-            </w:r>
-          </w:p>
-        </w:tc>
-        <w:tc>
-          <w:tcPr>
-            <w:tcW w:type="dxa" w:w="1384"/>
-          </w:tcPr>
-          <w:p>
-            <w:r>
-              <w:t>18.382166x</w:t>
-            </w:r>
-          </w:p>
-        </w:tc>
-        <w:tc>
-          <w:tcPr>
-            <w:tcW w:type="dxa" w:w="1384"/>
-          </w:tcPr>
-          <w:p>
-            <w:r>
-              <w:t>0</w:t>
+            <w:tcW w:type="dxa" w:w="4153"/>
+          </w:tcPr>
+          <w:p>
+            <w:r>
+              <w:t>torch_npu runnable-all speed gate</w:t>
+            </w:r>
+          </w:p>
+        </w:tc>
+        <w:tc>
+          <w:tcPr>
+            <w:tcW w:type="dxa" w:w="4153"/>
+          </w:tcPr>
+          <w:p>
+            <w:r>
+              <w:t>PASS &gt;= 1.2x</w:t>
             </w:r>
           </w:p>
         </w:tc>
@@ -1249,61 +474,21 @@
       <w:tr>
         <w:tc>
           <w:tcPr>
-            <w:tcW w:type="dxa" w:w="1384"/>
-          </w:tcPr>
-          <w:p>
-            <w:r>
-              <w:t>custom/mrope_17</w:t>
-            </w:r>
-          </w:p>
-        </w:tc>
-        <w:tc>
-          <w:tcPr>
-            <w:tcW w:type="dxa" w:w="1384"/>
-          </w:tcPr>
-          <w:p>
-            <w:r>
-              <w:t>task_npu_baseline</w:t>
-            </w:r>
-          </w:p>
-        </w:tc>
-        <w:tc>
-          <w:tcPr>
-            <w:tcW w:type="dxa" w:w="1384"/>
-          </w:tcPr>
-          <w:p>
-            <w:r>
-              <w:t>19.000 us</w:t>
-            </w:r>
-          </w:p>
-        </w:tc>
-        <w:tc>
-          <w:tcPr>
-            <w:tcW w:type="dxa" w:w="1384"/>
-          </w:tcPr>
-          <w:p>
-            <w:r>
-              <w:t>22.250 us</w:t>
-            </w:r>
-          </w:p>
-        </w:tc>
-        <w:tc>
-          <w:tcPr>
-            <w:tcW w:type="dxa" w:w="1384"/>
-          </w:tcPr>
-          <w:p>
-            <w:r>
-              <w:t>1.171053x</w:t>
-            </w:r>
-          </w:p>
-        </w:tc>
-        <w:tc>
-          <w:tcPr>
-            <w:tcW w:type="dxa" w:w="1384"/>
-          </w:tcPr>
-          <w:p>
-            <w:r>
-              <w:t>0</w:t>
+            <w:tcW w:type="dxa" w:w="4153"/>
+          </w:tcPr>
+          <w:p>
+            <w:r>
+              <w:t>public torch_npu runnable all</w:t>
+            </w:r>
+          </w:p>
+        </w:tc>
+        <w:tc>
+          <w:tcPr>
+            <w:tcW w:type="dxa" w:w="4153"/>
+          </w:tcPr>
+          <w:p>
+            <w:r>
+              <w:t>12</w:t>
             </w:r>
           </w:p>
         </w:tc>
@@ -1311,61 +496,21 @@
       <w:tr>
         <w:tc>
           <w:tcPr>
-            <w:tcW w:type="dxa" w:w="1384"/>
-          </w:tcPr>
-          <w:p>
-            <w:r>
-              <w:t>custom/mrope_18</w:t>
-            </w:r>
-          </w:p>
-        </w:tc>
-        <w:tc>
-          <w:tcPr>
-            <w:tcW w:type="dxa" w:w="1384"/>
-          </w:tcPr>
-          <w:p>
-            <w:r>
-              <w:t>pytorch_fallback</w:t>
-            </w:r>
-          </w:p>
-        </w:tc>
-        <w:tc>
-          <w:tcPr>
-            <w:tcW w:type="dxa" w:w="1384"/>
-          </w:tcPr>
-          <w:p>
-            <w:r>
-              <w:t>70.250 us</w:t>
-            </w:r>
-          </w:p>
-        </w:tc>
-        <w:tc>
-          <w:tcPr>
-            <w:tcW w:type="dxa" w:w="1384"/>
-          </w:tcPr>
-          <w:p>
-            <w:r>
-              <w:t>1030.250 us</w:t>
-            </w:r>
-          </w:p>
-        </w:tc>
-        <w:tc>
-          <w:tcPr>
-            <w:tcW w:type="dxa" w:w="1384"/>
-          </w:tcPr>
-          <w:p>
-            <w:r>
-              <w:t>14.665480x</w:t>
-            </w:r>
-          </w:p>
-        </w:tc>
-        <w:tc>
-          <w:tcPr>
-            <w:tcW w:type="dxa" w:w="1384"/>
-          </w:tcPr>
-          <w:p>
-            <w:r>
-              <w:t>0</w:t>
+            <w:tcW w:type="dxa" w:w="4153"/>
+          </w:tcPr>
+          <w:p>
+            <w:r>
+              <w:t>public torch_npu accuracy pass/fail</w:t>
+            </w:r>
+          </w:p>
+        </w:tc>
+        <w:tc>
+          <w:tcPr>
+            <w:tcW w:type="dxa" w:w="4153"/>
+          </w:tcPr>
+          <w:p>
+            <w:r>
+              <w:t>12/0</w:t>
             </w:r>
           </w:p>
         </w:tc>
@@ -1373,61 +518,21 @@
       <w:tr>
         <w:tc>
           <w:tcPr>
-            <w:tcW w:type="dxa" w:w="1384"/>
-          </w:tcPr>
-          <w:p>
-            <w:r>
-              <w:t>custom/mrope_19</w:t>
-            </w:r>
-          </w:p>
-        </w:tc>
-        <w:tc>
-          <w:tcPr>
-            <w:tcW w:type="dxa" w:w="1384"/>
-          </w:tcPr>
-          <w:p>
-            <w:r>
-              <w:t>task_npu_baseline</w:t>
-            </w:r>
-          </w:p>
-        </w:tc>
-        <w:tc>
-          <w:tcPr>
-            <w:tcW w:type="dxa" w:w="1384"/>
-          </w:tcPr>
-          <w:p>
-            <w:r>
-              <w:t>20.000 us</w:t>
-            </w:r>
-          </w:p>
-        </w:tc>
-        <w:tc>
-          <w:tcPr>
-            <w:tcW w:type="dxa" w:w="1384"/>
-          </w:tcPr>
-          <w:p>
-            <w:r>
-              <w:t>24.000 us</w:t>
-            </w:r>
-          </w:p>
-        </w:tc>
-        <w:tc>
-          <w:tcPr>
-            <w:tcW w:type="dxa" w:w="1384"/>
-          </w:tcPr>
-          <w:p>
-            <w:r>
-              <w:t>1.200000x</w:t>
-            </w:r>
-          </w:p>
-        </w:tc>
-        <w:tc>
-          <w:tcPr>
-            <w:tcW w:type="dxa" w:w="1384"/>
-          </w:tcPr>
-          <w:p>
-            <w:r>
-              <w:t>0</w:t>
+            <w:tcW w:type="dxa" w:w="4153"/>
+          </w:tcPr>
+          <w:p>
+            <w:r>
+              <w:t>aux public candidate active geomean</w:t>
+            </w:r>
+          </w:p>
+        </w:tc>
+        <w:tc>
+          <w:tcPr>
+            <w:tcW w:type="dxa" w:w="4153"/>
+          </w:tcPr>
+          <w:p>
+            <w:r>
+              <w:t>16.067 us</w:t>
             </w:r>
           </w:p>
         </w:tc>
@@ -1435,61 +540,540 @@
       <w:tr>
         <w:tc>
           <w:tcPr>
-            <w:tcW w:type="dxa" w:w="1384"/>
-          </w:tcPr>
-          <w:p>
-            <w:r>
-              <w:t>custom/mrope_20</w:t>
-            </w:r>
-          </w:p>
-        </w:tc>
-        <w:tc>
-          <w:tcPr>
-            <w:tcW w:type="dxa" w:w="1384"/>
-          </w:tcPr>
-          <w:p>
-            <w:r>
-              <w:t>pytorch_fallback</w:t>
-            </w:r>
-          </w:p>
-        </w:tc>
-        <w:tc>
-          <w:tcPr>
-            <w:tcW w:type="dxa" w:w="1384"/>
-          </w:tcPr>
-          <w:p>
-            <w:r>
-              <w:t>90.500 us</w:t>
-            </w:r>
-          </w:p>
-        </w:tc>
-        <w:tc>
-          <w:tcPr>
-            <w:tcW w:type="dxa" w:w="1384"/>
-          </w:tcPr>
-          <w:p>
-            <w:r>
-              <w:t>985.000 us</w:t>
-            </w:r>
-          </w:p>
-        </w:tc>
-        <w:tc>
-          <w:tcPr>
-            <w:tcW w:type="dxa" w:w="1384"/>
-          </w:tcPr>
-          <w:p>
-            <w:r>
-              <w:t>10.883978x</w:t>
-            </w:r>
-          </w:p>
-        </w:tc>
-        <w:tc>
-          <w:tcPr>
-            <w:tcW w:type="dxa" w:w="1384"/>
+            <w:tcW w:type="dxa" w:w="4153"/>
+          </w:tcPr>
+          <w:p>
+            <w:r>
+              <w:t>aux public selected baseline active geomean</w:t>
+            </w:r>
+          </w:p>
+        </w:tc>
+        <w:tc>
+          <w:tcPr>
+            <w:tcW w:type="dxa" w:w="4153"/>
+          </w:tcPr>
+          <w:p>
+            <w:r>
+              <w:t>13.369 us</w:t>
+            </w:r>
+          </w:p>
+        </w:tc>
+      </w:tr>
+      <w:tr>
+        <w:tc>
+          <w:tcPr>
+            <w:tcW w:type="dxa" w:w="4153"/>
+          </w:tcPr>
+          <w:p>
+            <w:r>
+              <w:t>aux public selected active/active geomean speedup</w:t>
+            </w:r>
+          </w:p>
+        </w:tc>
+        <w:tc>
+          <w:tcPr>
+            <w:tcW w:type="dxa" w:w="4153"/>
+          </w:tcPr>
+          <w:p>
+            <w:r>
+              <w:t>1.220977x</w:t>
+            </w:r>
+          </w:p>
+        </w:tc>
+      </w:tr>
+      <w:tr>
+        <w:tc>
+          <w:tcPr>
+            <w:tcW w:type="dxa" w:w="4153"/>
+          </w:tcPr>
+          <w:p>
+            <w:r>
+              <w:t>max candidate RMSE</w:t>
+            </w:r>
+          </w:p>
+        </w:tc>
+        <w:tc>
+          <w:tcPr>
+            <w:tcW w:type="dxa" w:w="4153"/>
           </w:tcPr>
           <w:p>
             <w:r>
               <w:t>0</w:t>
+            </w:r>
+          </w:p>
+        </w:tc>
+      </w:tr>
+      <w:tr>
+        <w:tc>
+          <w:tcPr>
+            <w:tcW w:type="dxa" w:w="4153"/>
+          </w:tcPr>
+          <w:p>
+            <w:r>
+              <w:t>commercial standard</w:t>
+            </w:r>
+          </w:p>
+        </w:tc>
+        <w:tc>
+          <w:tcPr>
+            <w:tcW w:type="dxa" w:w="4153"/>
+          </w:tcPr>
+          <w:p>
+            <w:r>
+              <w:t>references/commercial_standard.md @ c260c8ab7a9be4823ac8f8a07c60442de9bf141e</w:t>
+            </w:r>
+          </w:p>
+        </w:tc>
+      </w:tr>
+    </w:tbl>
+    <w:p>
+      <w:r>
+        <w:t>性能口径汇总</w:t>
+      </w:r>
+    </w:p>
+    <w:tbl>
+      <w:tblPr>
+        <w:tblStyle w:val="aa"/>
+        <w:tblW w:type="auto" w:w="0"/>
+        <w:tblLook w:firstColumn="1" w:firstRow="1" w:lastColumn="0" w:lastRow="0" w:noHBand="0" w:noVBand="1" w:val="04A0"/>
+      </w:tblPr>
+      <w:tblGrid>
+        <w:gridCol w:w="1187"/>
+        <w:gridCol w:w="1187"/>
+        <w:gridCol w:w="1187"/>
+        <w:gridCol w:w="1187"/>
+        <w:gridCol w:w="1187"/>
+        <w:gridCol w:w="1187"/>
+        <w:gridCol w:w="1187"/>
+      </w:tblGrid>
+      <w:tr>
+        <w:tc>
+          <w:tcPr>
+            <w:tcW w:type="dxa" w:w="1187"/>
+          </w:tcPr>
+          <w:p>
+            <w:r>
+              <w:t>Scope</w:t>
+            </w:r>
+          </w:p>
+        </w:tc>
+        <w:tc>
+          <w:tcPr>
+            <w:tcW w:type="dxa" w:w="1187"/>
+          </w:tcPr>
+          <w:p>
+            <w:r>
+              <w:t>Cases</w:t>
+            </w:r>
+          </w:p>
+        </w:tc>
+        <w:tc>
+          <w:tcPr>
+            <w:tcW w:type="dxa" w:w="1187"/>
+          </w:tcPr>
+          <w:p>
+            <w:r>
+              <w:t>Candidate active geomean</w:t>
+            </w:r>
+          </w:p>
+        </w:tc>
+        <w:tc>
+          <w:tcPr>
+            <w:tcW w:type="dxa" w:w="1187"/>
+          </w:tcPr>
+          <w:p>
+            <w:r>
+              <w:t>Baseline active geomean</w:t>
+            </w:r>
+          </w:p>
+        </w:tc>
+        <w:tc>
+          <w:tcPr>
+            <w:tcW w:type="dxa" w:w="1187"/>
+          </w:tcPr>
+          <w:p>
+            <w:r>
+              <w:t>Active/active geomean speedup</w:t>
+            </w:r>
+          </w:p>
+        </w:tc>
+        <w:tc>
+          <w:tcPr>
+            <w:tcW w:type="dxa" w:w="1187"/>
+          </w:tcPr>
+          <w:p>
+            <w:r>
+              <w:t>Precision pass</w:t>
+            </w:r>
+          </w:p>
+        </w:tc>
+        <w:tc>
+          <w:tcPr>
+            <w:tcW w:type="dxa" w:w="1187"/>
+          </w:tcPr>
+          <w:p>
+            <w:r>
+              <w:t>Note</w:t>
+            </w:r>
+          </w:p>
+        </w:tc>
+      </w:tr>
+      <w:tr>
+        <w:tc>
+          <w:tcPr>
+            <w:tcW w:type="dxa" w:w="1187"/>
+          </w:tcPr>
+          <w:p>
+            <w:r>
+              <w:t>main torch_npu timed sample</w:t>
+            </w:r>
+          </w:p>
+        </w:tc>
+        <w:tc>
+          <w:tcPr>
+            <w:tcW w:type="dxa" w:w="1187"/>
+          </w:tcPr>
+          <w:p>
+            <w:r>
+              <w:t>31</w:t>
+            </w:r>
+          </w:p>
+        </w:tc>
+        <w:tc>
+          <w:tcPr>
+            <w:tcW w:type="dxa" w:w="1187"/>
+          </w:tcPr>
+          <w:p>
+            <w:r>
+              <w:t>11.271 us</w:t>
+            </w:r>
+          </w:p>
+        </w:tc>
+        <w:tc>
+          <w:tcPr>
+            <w:tcW w:type="dxa" w:w="1187"/>
+          </w:tcPr>
+          <w:p>
+            <w:r>
+              <w:t>13.765 us</w:t>
+            </w:r>
+          </w:p>
+        </w:tc>
+        <w:tc>
+          <w:tcPr>
+            <w:tcW w:type="dxa" w:w="1187"/>
+          </w:tcPr>
+          <w:p>
+            <w:r>
+              <w:t>1.211017x</w:t>
+            </w:r>
+          </w:p>
+        </w:tc>
+        <w:tc>
+          <w:tcPr>
+            <w:tcW w:type="dxa" w:w="1187"/>
+          </w:tcPr>
+          <w:p>
+            <w:r>
+              <w:t>31/31</w:t>
+            </w:r>
+          </w:p>
+        </w:tc>
+        <w:tc>
+          <w:tcPr>
+            <w:tcW w:type="dxa" w:w="1187"/>
+          </w:tcPr>
+          <w:p>
+            <w:r>
+              <w:t>主速度验收口径；candidate 和 torch_npu 均只在这同一批有 torch_npu active 计时的 case 上取几何平均；gate &gt;= 1.2x</w:t>
+            </w:r>
+          </w:p>
+        </w:tc>
+      </w:tr>
+      <w:tr>
+        <w:tc>
+          <w:tcPr>
+            <w:tcW w:type="dxa" w:w="1187"/>
+          </w:tcPr>
+          <w:p>
+            <w:r>
+              <w:t>torch_npu accuracy-pass</w:t>
+            </w:r>
+          </w:p>
+        </w:tc>
+        <w:tc>
+          <w:tcPr>
+            <w:tcW w:type="dxa" w:w="1187"/>
+          </w:tcPr>
+          <w:p>
+            <w:r>
+              <w:t>31</w:t>
+            </w:r>
+          </w:p>
+        </w:tc>
+        <w:tc>
+          <w:tcPr>
+            <w:tcW w:type="dxa" w:w="1187"/>
+          </w:tcPr>
+          <w:p>
+            <w:r>
+              <w:t>11.271 us</w:t>
+            </w:r>
+          </w:p>
+        </w:tc>
+        <w:tc>
+          <w:tcPr>
+            <w:tcW w:type="dxa" w:w="1187"/>
+          </w:tcPr>
+          <w:p>
+            <w:r>
+              <w:t>13.765 us</w:t>
+            </w:r>
+          </w:p>
+        </w:tc>
+        <w:tc>
+          <w:tcPr>
+            <w:tcW w:type="dxa" w:w="1187"/>
+          </w:tcPr>
+          <w:p>
+            <w:r>
+              <w:t>1.211017x</w:t>
+            </w:r>
+          </w:p>
+        </w:tc>
+        <w:tc>
+          <w:tcPr>
+            <w:tcW w:type="dxa" w:w="1187"/>
+          </w:tcPr>
+          <w:p>
+            <w:r>
+              <w:t>31/31</w:t>
+            </w:r>
+          </w:p>
+        </w:tc>
+        <w:tc>
+          <w:tcPr>
+            <w:tcW w:type="dxa" w:w="1187"/>
+          </w:tcPr>
+          <w:p>
+            <w:r>
+              <w:t>全量 torch_npu 有效计时且本地 checker PASS 子集</w:t>
+            </w:r>
+          </w:p>
+        </w:tc>
+      </w:tr>
+      <w:tr>
+        <w:tc>
+          <w:tcPr>
+            <w:tcW w:type="dxa" w:w="1187"/>
+          </w:tcPr>
+          <w:p>
+            <w:r>
+              <w:t>torch_npu accuracy-fail</w:t>
+            </w:r>
+          </w:p>
+        </w:tc>
+        <w:tc>
+          <w:tcPr>
+            <w:tcW w:type="dxa" w:w="1187"/>
+          </w:tcPr>
+          <w:p>
+            <w:r>
+              <w:t>0</w:t>
+            </w:r>
+          </w:p>
+        </w:tc>
+        <w:tc>
+          <w:tcPr>
+            <w:tcW w:type="dxa" w:w="1187"/>
+          </w:tcPr>
+          <w:p>
+            <w:r>
+              <w:t>N/A</w:t>
+            </w:r>
+          </w:p>
+        </w:tc>
+        <w:tc>
+          <w:tcPr>
+            <w:tcW w:type="dxa" w:w="1187"/>
+          </w:tcPr>
+          <w:p>
+            <w:r>
+              <w:t>N/A</w:t>
+            </w:r>
+          </w:p>
+        </w:tc>
+        <w:tc>
+          <w:tcPr>
+            <w:tcW w:type="dxa" w:w="1187"/>
+          </w:tcPr>
+          <w:p>
+            <w:r>
+              <w:t>N/A</w:t>
+            </w:r>
+          </w:p>
+        </w:tc>
+        <w:tc>
+          <w:tcPr>
+            <w:tcW w:type="dxa" w:w="1187"/>
+          </w:tcPr>
+          <w:p>
+            <w:r>
+              <w:t>0/0</w:t>
+            </w:r>
+          </w:p>
+        </w:tc>
+        <w:tc>
+          <w:tcPr>
+            <w:tcW w:type="dxa" w:w="1187"/>
+          </w:tcPr>
+          <w:p>
+            <w:r>
+              <w:t>全量 torch_npu 有效计时但本地 checker FAIL 子集</w:t>
+            </w:r>
+          </w:p>
+        </w:tc>
+      </w:tr>
+      <w:tr>
+        <w:tc>
+          <w:tcPr>
+            <w:tcW w:type="dxa" w:w="1187"/>
+          </w:tcPr>
+          <w:p>
+            <w:r>
+              <w:t>aux public selected baseline</w:t>
+            </w:r>
+          </w:p>
+        </w:tc>
+        <w:tc>
+          <w:tcPr>
+            <w:tcW w:type="dxa" w:w="1187"/>
+          </w:tcPr>
+          <w:p>
+            <w:r>
+              <w:t>20</w:t>
+            </w:r>
+          </w:p>
+        </w:tc>
+        <w:tc>
+          <w:tcPr>
+            <w:tcW w:type="dxa" w:w="1187"/>
+          </w:tcPr>
+          <w:p>
+            <w:r>
+              <w:t>16.067 us</w:t>
+            </w:r>
+          </w:p>
+        </w:tc>
+        <w:tc>
+          <w:tcPr>
+            <w:tcW w:type="dxa" w:w="1187"/>
+          </w:tcPr>
+          <w:p>
+            <w:r>
+              <w:t>13.369 us</w:t>
+            </w:r>
+          </w:p>
+        </w:tc>
+        <w:tc>
+          <w:tcPr>
+            <w:tcW w:type="dxa" w:w="1187"/>
+          </w:tcPr>
+          <w:p>
+            <w:r>
+              <w:t>1.220977x</w:t>
+            </w:r>
+          </w:p>
+        </w:tc>
+        <w:tc>
+          <w:tcPr>
+            <w:tcW w:type="dxa" w:w="1187"/>
+          </w:tcPr>
+          <w:p>
+            <w:r>
+              <w:t>20/20</w:t>
+            </w:r>
+          </w:p>
+        </w:tc>
+        <w:tc>
+          <w:tcPr>
+            <w:tcW w:type="dxa" w:w="1187"/>
+          </w:tcPr>
+          <w:p>
+            <w:r>
+              <w:t>补充语义标杆口径；torch_npu 仅在本地 checker 通过时选中，否则选 Torch</w:t>
+            </w:r>
+          </w:p>
+        </w:tc>
+      </w:tr>
+      <w:tr>
+        <w:tc>
+          <w:tcPr>
+            <w:tcW w:type="dxa" w:w="1187"/>
+          </w:tcPr>
+          <w:p>
+            <w:r>
+              <w:t>aux public torch semantic baseline</w:t>
+            </w:r>
+          </w:p>
+        </w:tc>
+        <w:tc>
+          <w:tcPr>
+            <w:tcW w:type="dxa" w:w="1187"/>
+          </w:tcPr>
+          <w:p>
+            <w:r>
+              <w:t>20</w:t>
+            </w:r>
+          </w:p>
+        </w:tc>
+        <w:tc>
+          <w:tcPr>
+            <w:tcW w:type="dxa" w:w="1187"/>
+          </w:tcPr>
+          <w:p>
+            <w:r>
+              <w:t>16.067 us</w:t>
+            </w:r>
+          </w:p>
+        </w:tc>
+        <w:tc>
+          <w:tcPr>
+            <w:tcW w:type="dxa" w:w="1187"/>
+          </w:tcPr>
+          <w:p>
+            <w:r>
+              <w:t>N/A</w:t>
+            </w:r>
+          </w:p>
+        </w:tc>
+        <w:tc>
+          <w:tcPr>
+            <w:tcW w:type="dxa" w:w="1187"/>
+          </w:tcPr>
+          <w:p>
+            <w:r>
+              <w:t>N/A</w:t>
+            </w:r>
+          </w:p>
+        </w:tc>
+        <w:tc>
+          <w:tcPr>
+            <w:tcW w:type="dxa" w:w="1187"/>
+          </w:tcPr>
+          <w:p>
+            <w:r>
+              <w:t>20/20</w:t>
+            </w:r>
+          </w:p>
+        </w:tc>
+        <w:tc>
+          <w:tcPr>
+            <w:tcW w:type="dxa" w:w="1187"/>
+          </w:tcPr>
+          <w:p>
+            <w:r>
+              <w:t>补充 Torch 语义参考口径，始终作为精度语义基准</w:t>
             </w:r>
           </w:p>
         </w:tc>

</xml_diff>